<commit_message>
EM Quali for LF3a
</commit_message>
<xml_diff>
--- a/12_Datenkapsel/Übungen/EMQualifikation/2022a/EMQualification-2020WithProperties.docx
+++ b/12_Datenkapsel/Übungen/EMQualifikation/2022a/EMQualification-2020WithProperties.docx
@@ -81,7 +81,7 @@
         </w:rPr>
       </w:pPr>
       <w:r>
-        <w:t xml:space="preserve">Definieren sie eine Datenkapsel </w:t>
+        <w:t xml:space="preserve">Definieren sie eine Objektklasse </w:t>
       </w:r>
       <w:r>
         <w:rPr>
@@ -95,43 +95,17 @@
       </w:r>
       <w:r>
         <w:br/>
-        <w:t>Erstellen</w:t>
-      </w:r>
-      <w:r>
-        <w:t xml:space="preserve"> Sie die folgenden </w:t>
-      </w:r>
-      <w:r>
-        <w:t>Eigenschaften</w:t>
-      </w:r>
-      <w:r>
-        <w:t xml:space="preserve"> und implementieren Sie dafür die </w:t>
-      </w:r>
-      <w:r>
-        <w:t>„</w:t>
-      </w:r>
-      <w:r>
-        <w:t>Get</w:t>
-      </w:r>
-      <w:r>
-        <w:t>“</w:t>
-      </w:r>
-      <w:r>
-        <w:t xml:space="preserve"> und </w:t>
-      </w:r>
-      <w:r>
-        <w:t>„</w:t>
-      </w:r>
-      <w:r>
-        <w:t>Set</w:t>
-      </w:r>
-      <w:r>
-        <w:t>“</w:t>
-      </w:r>
-      <w:r>
-        <w:t xml:space="preserve"> Methoden.</w:t>
-      </w:r>
-      <w:r>
-        <w:t xml:space="preserve"> </w:t>
+        <w:t xml:space="preserve">Erstellen Sie die folgenden Eigenschaften als </w:t>
+      </w:r>
+      <w:r>
+        <w:rPr>
+          <w:b/>
+          <w:bCs/>
+        </w:rPr>
+        <w:t>Auto-Properties</w:t>
+      </w:r>
+      <w:r>
+        <w:t xml:space="preserve">. </w:t>
       </w:r>
     </w:p>
     <w:p>
@@ -147,10 +121,7 @@
       </w:r>
       <w:r>
         <w:tab/>
-        <w:t>D</w:t>
-      </w:r>
-      <w:r>
-        <w:t>ate</w:t>
+        <w:t>Date</w:t>
       </w:r>
     </w:p>
     <w:p>
@@ -166,10 +137,7 @@
       </w:r>
       <w:r>
         <w:tab/>
-        <w:t>H</w:t>
-      </w:r>
-      <w:r>
-        <w:t>omeTeam</w:t>
+        <w:t>HomeTeam</w:t>
       </w:r>
     </w:p>
     <w:p>
@@ -185,10 +153,7 @@
       </w:r>
       <w:r>
         <w:tab/>
-        <w:t>G</w:t>
-      </w:r>
-      <w:r>
-        <w:t>uestTeam</w:t>
+        <w:t>GuestTeam</w:t>
       </w:r>
     </w:p>
     <w:p>
@@ -204,10 +169,7 @@
       </w:r>
       <w:r>
         <w:tab/>
-        <w:t>G</w:t>
-      </w:r>
-      <w:r>
-        <w:t>oalsHome</w:t>
+        <w:t>GoalsHome</w:t>
       </w:r>
     </w:p>
     <w:p>
@@ -223,13 +185,71 @@
       </w:r>
       <w:r>
         <w:tab/>
-        <w:t>G</w:t>
-      </w:r>
-      <w:r>
-        <w:t>oalsGuest</w:t>
+        <w:t>GoalsGuest</w:t>
+      </w:r>
+    </w:p>
+    <w:p>
+      <w:pPr>
+        <w:ind w:left="360"/>
+      </w:pPr>
+      <w:r>
+        <w:t xml:space="preserve">In der Klasse sind folgende Methoden zu definieren </w:t>
+      </w:r>
+    </w:p>
+    <w:p>
+      <w:pPr>
+        <w:pStyle w:val="Listenabsatz"/>
+        <w:numPr>
+          <w:ilvl w:val="0"/>
+          <w:numId w:val="27"/>
+        </w:numPr>
+      </w:pPr>
+      <w:r>
+        <w:t>bool IsGameOfTeam(string team)</w:t>
       </w:r>
       <w:r>
         <w:br/>
+        <w:t>Dies Methode prüft, ob im Game das Team als Guest oder Home hinterlegt ist.</w:t>
+      </w:r>
+    </w:p>
+    <w:p>
+      <w:pPr>
+        <w:pStyle w:val="Listenabsatz"/>
+        <w:numPr>
+          <w:ilvl w:val="0"/>
+          <w:numId w:val="27"/>
+        </w:numPr>
+      </w:pPr>
+      <w:r>
+        <w:t>bool IsHomeGameOfTeam(string team)</w:t>
+      </w:r>
+      <w:r>
+        <w:br/>
+        <w:t>Dies Methode prüft, ob im Game das Team als Home hinterlegt ist.</w:t>
+      </w:r>
+    </w:p>
+    <w:p>
+      <w:pPr>
+        <w:pStyle w:val="Listenabsatz"/>
+        <w:numPr>
+          <w:ilvl w:val="0"/>
+          <w:numId w:val="27"/>
+        </w:numPr>
+      </w:pPr>
+      <w:r>
+        <w:t>bool IsGuestGameOfTeam(string team)</w:t>
+      </w:r>
+      <w:r>
+        <w:br/>
+        <w:t>Dies Methode prüft, ob im Game das Team als Guest hinterlegt ist.</w:t>
+      </w:r>
+    </w:p>
+    <w:p>
+      <w:pPr>
+        <w:ind w:left="360"/>
+      </w:pPr>
+      <w:r>
+        <w:t>Die Prüfung, ob ein Team Home oder Guest ist, muss unabhängig von der Groß/Kleinschreibung sein. Es reicht auch, wenn das gesuchte Team im Home oder Guest enthalten ist.</w:t>
       </w:r>
     </w:p>
     <w:p>
@@ -473,6 +493,7 @@
         <w:rPr>
           <w:rFonts w:ascii="Courier New" w:hAnsi="Courier New" w:cs="Courier New"/>
         </w:rPr>
+        <w:lastRenderedPageBreak/>
         <w:t>07.06.2019 Mazedonien      Polen           0:1</w:t>
       </w:r>
     </w:p>
@@ -587,11 +608,7 @@
         <w:t>L</w:t>
       </w:r>
       <w:r>
-        <w:t xml:space="preserve">andes </w:t>
-      </w:r>
-      <w:r>
-        <w:lastRenderedPageBreak/>
-        <w:t>geschossen hat und</w:t>
+        <w:t>andes geschossen hat und</w:t>
       </w:r>
       <w:r>
         <w:t xml:space="preserve"> die Anzahl der Tore, die es bekommen hat.</w:t>
@@ -881,13 +898,7 @@
         <w:t xml:space="preserve">Berechnung der </w:t>
       </w:r>
       <w:r>
-        <w:t xml:space="preserve">Tordifferenz </w:t>
-      </w:r>
-      <w:r>
-        <w:t>(3&amp;4)</w:t>
-      </w:r>
-      <w:r>
-        <w:t xml:space="preserve"> für verschiedene Länder durchführen. Das Programm bricht ab, wenn kein Land (leere Zeichenkette) eingegeben wird.</w:t>
+        <w:t>Tordifferenz (3&amp;4) für verschiedene Länder durchführen. Das Programm bricht ab, wenn kein Land (leere Zeichenkette) eingegeben wird.</w:t>
       </w:r>
     </w:p>
     <w:p>
@@ -925,19 +936,7 @@
         </w:numPr>
       </w:pPr>
       <w:r>
-        <w:t xml:space="preserve">Verwenden Sie </w:t>
-      </w:r>
-      <w:r>
-        <w:t>das</w:t>
-      </w:r>
-      <w:r>
-        <w:t xml:space="preserve"> bereitgestellte Programm-</w:t>
-      </w:r>
-      <w:r>
-        <w:t>Template</w:t>
-      </w:r>
-      <w:r>
-        <w:t xml:space="preserve"> als Schablone für Ihre Lösung. Die durch den Kommentar </w:t>
+        <w:t xml:space="preserve">Verwenden Sie das bereitgestellte Programm-Template als Schablone für Ihre Lösung. Die durch den Kommentar </w:t>
       </w:r>
       <w:r>
         <w:rPr>
@@ -989,16 +988,7 @@
         </w:numPr>
       </w:pPr>
       <w:r>
-        <w:t xml:space="preserve">Achten Sie auf </w:t>
-      </w:r>
-      <w:r>
-        <w:t xml:space="preserve">ein </w:t>
-      </w:r>
-      <w:r>
-        <w:t>gutes Methodendesign</w:t>
-      </w:r>
-      <w:r>
-        <w:t>!</w:t>
+        <w:t>Achten Sie auf ein gutes Methodendesign!</w:t>
       </w:r>
     </w:p>
     <w:p>
@@ -2460,6 +2450,119 @@
     </w:lvl>
   </w:abstractNum>
   <w:abstractNum w:abstractNumId="10" w15:restartNumberingAfterBreak="0">
+    <w:nsid w:val="2B7C5ED5"/>
+    <w:multiLevelType w:val="hybridMultilevel"/>
+    <w:tmpl w:val="A2121B62"/>
+    <w:lvl w:ilvl="0" w:tplc="0C070001">
+      <w:start w:val="1"/>
+      <w:numFmt w:val="bullet"/>
+      <w:lvlText w:val=""/>
+      <w:lvlJc w:val="left"/>
+      <w:pPr>
+        <w:ind w:left="720" w:hanging="360"/>
+      </w:pPr>
+      <w:rPr>
+        <w:rFonts w:ascii="Symbol" w:hAnsi="Symbol" w:hint="default"/>
+      </w:rPr>
+    </w:lvl>
+    <w:lvl w:ilvl="1" w:tplc="0C070003" w:tentative="1">
+      <w:start w:val="1"/>
+      <w:numFmt w:val="bullet"/>
+      <w:lvlText w:val="o"/>
+      <w:lvlJc w:val="left"/>
+      <w:pPr>
+        <w:ind w:left="1440" w:hanging="360"/>
+      </w:pPr>
+      <w:rPr>
+        <w:rFonts w:ascii="Courier New" w:hAnsi="Courier New" w:cs="Courier New" w:hint="default"/>
+      </w:rPr>
+    </w:lvl>
+    <w:lvl w:ilvl="2" w:tplc="0C070005" w:tentative="1">
+      <w:start w:val="1"/>
+      <w:numFmt w:val="bullet"/>
+      <w:lvlText w:val=""/>
+      <w:lvlJc w:val="left"/>
+      <w:pPr>
+        <w:ind w:left="2160" w:hanging="360"/>
+      </w:pPr>
+      <w:rPr>
+        <w:rFonts w:ascii="Wingdings" w:hAnsi="Wingdings" w:hint="default"/>
+      </w:rPr>
+    </w:lvl>
+    <w:lvl w:ilvl="3" w:tplc="0C070001" w:tentative="1">
+      <w:start w:val="1"/>
+      <w:numFmt w:val="bullet"/>
+      <w:lvlText w:val=""/>
+      <w:lvlJc w:val="left"/>
+      <w:pPr>
+        <w:ind w:left="2880" w:hanging="360"/>
+      </w:pPr>
+      <w:rPr>
+        <w:rFonts w:ascii="Symbol" w:hAnsi="Symbol" w:hint="default"/>
+      </w:rPr>
+    </w:lvl>
+    <w:lvl w:ilvl="4" w:tplc="0C070003" w:tentative="1">
+      <w:start w:val="1"/>
+      <w:numFmt w:val="bullet"/>
+      <w:lvlText w:val="o"/>
+      <w:lvlJc w:val="left"/>
+      <w:pPr>
+        <w:ind w:left="3600" w:hanging="360"/>
+      </w:pPr>
+      <w:rPr>
+        <w:rFonts w:ascii="Courier New" w:hAnsi="Courier New" w:cs="Courier New" w:hint="default"/>
+      </w:rPr>
+    </w:lvl>
+    <w:lvl w:ilvl="5" w:tplc="0C070005" w:tentative="1">
+      <w:start w:val="1"/>
+      <w:numFmt w:val="bullet"/>
+      <w:lvlText w:val=""/>
+      <w:lvlJc w:val="left"/>
+      <w:pPr>
+        <w:ind w:left="4320" w:hanging="360"/>
+      </w:pPr>
+      <w:rPr>
+        <w:rFonts w:ascii="Wingdings" w:hAnsi="Wingdings" w:hint="default"/>
+      </w:rPr>
+    </w:lvl>
+    <w:lvl w:ilvl="6" w:tplc="0C070001" w:tentative="1">
+      <w:start w:val="1"/>
+      <w:numFmt w:val="bullet"/>
+      <w:lvlText w:val=""/>
+      <w:lvlJc w:val="left"/>
+      <w:pPr>
+        <w:ind w:left="5040" w:hanging="360"/>
+      </w:pPr>
+      <w:rPr>
+        <w:rFonts w:ascii="Symbol" w:hAnsi="Symbol" w:hint="default"/>
+      </w:rPr>
+    </w:lvl>
+    <w:lvl w:ilvl="7" w:tplc="0C070003" w:tentative="1">
+      <w:start w:val="1"/>
+      <w:numFmt w:val="bullet"/>
+      <w:lvlText w:val="o"/>
+      <w:lvlJc w:val="left"/>
+      <w:pPr>
+        <w:ind w:left="5760" w:hanging="360"/>
+      </w:pPr>
+      <w:rPr>
+        <w:rFonts w:ascii="Courier New" w:hAnsi="Courier New" w:cs="Courier New" w:hint="default"/>
+      </w:rPr>
+    </w:lvl>
+    <w:lvl w:ilvl="8" w:tplc="0C070005" w:tentative="1">
+      <w:start w:val="1"/>
+      <w:numFmt w:val="bullet"/>
+      <w:lvlText w:val=""/>
+      <w:lvlJc w:val="left"/>
+      <w:pPr>
+        <w:ind w:left="6480" w:hanging="360"/>
+      </w:pPr>
+      <w:rPr>
+        <w:rFonts w:ascii="Wingdings" w:hAnsi="Wingdings" w:hint="default"/>
+      </w:rPr>
+    </w:lvl>
+  </w:abstractNum>
+  <w:abstractNum w:abstractNumId="11" w15:restartNumberingAfterBreak="0">
     <w:nsid w:val="31EB432E"/>
     <w:multiLevelType w:val="hybridMultilevel"/>
     <w:tmpl w:val="D72C559E"/>
@@ -2572,7 +2675,7 @@
       </w:rPr>
     </w:lvl>
   </w:abstractNum>
-  <w:abstractNum w:abstractNumId="11" w15:restartNumberingAfterBreak="0">
+  <w:abstractNum w:abstractNumId="12" w15:restartNumberingAfterBreak="0">
     <w:nsid w:val="37B30879"/>
     <w:multiLevelType w:val="hybridMultilevel"/>
     <w:tmpl w:val="DA98B0D8"/>
@@ -2662,7 +2765,7 @@
       </w:pPr>
     </w:lvl>
   </w:abstractNum>
-  <w:abstractNum w:abstractNumId="12" w15:restartNumberingAfterBreak="0">
+  <w:abstractNum w:abstractNumId="13" w15:restartNumberingAfterBreak="0">
     <w:nsid w:val="37FF73BC"/>
     <w:multiLevelType w:val="hybridMultilevel"/>
     <w:tmpl w:val="6CC2E56E"/>
@@ -2775,7 +2878,7 @@
       </w:rPr>
     </w:lvl>
   </w:abstractNum>
-  <w:abstractNum w:abstractNumId="13" w15:restartNumberingAfterBreak="0">
+  <w:abstractNum w:abstractNumId="14" w15:restartNumberingAfterBreak="0">
     <w:nsid w:val="39041E2D"/>
     <w:multiLevelType w:val="hybridMultilevel"/>
     <w:tmpl w:val="A21A5EDC"/>
@@ -2888,7 +2991,7 @@
       </w:rPr>
     </w:lvl>
   </w:abstractNum>
-  <w:abstractNum w:abstractNumId="14" w15:restartNumberingAfterBreak="0">
+  <w:abstractNum w:abstractNumId="15" w15:restartNumberingAfterBreak="0">
     <w:nsid w:val="3C5303D7"/>
     <w:multiLevelType w:val="hybridMultilevel"/>
     <w:tmpl w:val="62166E80"/>
@@ -2977,7 +3080,7 @@
       </w:pPr>
     </w:lvl>
   </w:abstractNum>
-  <w:abstractNum w:abstractNumId="15" w15:restartNumberingAfterBreak="0">
+  <w:abstractNum w:abstractNumId="16" w15:restartNumberingAfterBreak="0">
     <w:nsid w:val="449C57DA"/>
     <w:multiLevelType w:val="hybridMultilevel"/>
     <w:tmpl w:val="34D2E24A"/>
@@ -3089,7 +3192,7 @@
       </w:rPr>
     </w:lvl>
   </w:abstractNum>
-  <w:abstractNum w:abstractNumId="16" w15:restartNumberingAfterBreak="0">
+  <w:abstractNum w:abstractNumId="17" w15:restartNumberingAfterBreak="0">
     <w:nsid w:val="46321CCB"/>
     <w:multiLevelType w:val="multilevel"/>
     <w:tmpl w:val="A8566D82"/>
@@ -3230,7 +3333,7 @@
       </w:rPr>
     </w:lvl>
   </w:abstractNum>
-  <w:abstractNum w:abstractNumId="17" w15:restartNumberingAfterBreak="0">
+  <w:abstractNum w:abstractNumId="18" w15:restartNumberingAfterBreak="0">
     <w:nsid w:val="47124B6D"/>
     <w:multiLevelType w:val="hybridMultilevel"/>
     <w:tmpl w:val="24C03722"/>
@@ -3343,7 +3446,7 @@
       </w:rPr>
     </w:lvl>
   </w:abstractNum>
-  <w:abstractNum w:abstractNumId="18" w15:restartNumberingAfterBreak="0">
+  <w:abstractNum w:abstractNumId="19" w15:restartNumberingAfterBreak="0">
     <w:nsid w:val="47CC2269"/>
     <w:multiLevelType w:val="hybridMultilevel"/>
     <w:tmpl w:val="117AE242"/>
@@ -3455,7 +3558,7 @@
       </w:rPr>
     </w:lvl>
   </w:abstractNum>
-  <w:abstractNum w:abstractNumId="19" w15:restartNumberingAfterBreak="0">
+  <w:abstractNum w:abstractNumId="20" w15:restartNumberingAfterBreak="0">
     <w:nsid w:val="54DC321F"/>
     <w:multiLevelType w:val="hybridMultilevel"/>
     <w:tmpl w:val="23002172"/>
@@ -3568,7 +3671,7 @@
       </w:rPr>
     </w:lvl>
   </w:abstractNum>
-  <w:abstractNum w:abstractNumId="20" w15:restartNumberingAfterBreak="0">
+  <w:abstractNum w:abstractNumId="21" w15:restartNumberingAfterBreak="0">
     <w:nsid w:val="59A60227"/>
     <w:multiLevelType w:val="hybridMultilevel"/>
     <w:tmpl w:val="7E480E9E"/>
@@ -3654,7 +3757,7 @@
       </w:pPr>
     </w:lvl>
   </w:abstractNum>
-  <w:abstractNum w:abstractNumId="21" w15:restartNumberingAfterBreak="0">
+  <w:abstractNum w:abstractNumId="22" w15:restartNumberingAfterBreak="0">
     <w:nsid w:val="5FDB17A2"/>
     <w:multiLevelType w:val="hybridMultilevel"/>
     <w:tmpl w:val="AECEAAA4"/>
@@ -3767,7 +3870,7 @@
       </w:rPr>
     </w:lvl>
   </w:abstractNum>
-  <w:abstractNum w:abstractNumId="22" w15:restartNumberingAfterBreak="0">
+  <w:abstractNum w:abstractNumId="23" w15:restartNumberingAfterBreak="0">
     <w:nsid w:val="63127570"/>
     <w:multiLevelType w:val="hybridMultilevel"/>
     <w:tmpl w:val="4A44A094"/>
@@ -3880,7 +3983,7 @@
       </w:rPr>
     </w:lvl>
   </w:abstractNum>
-  <w:abstractNum w:abstractNumId="23" w15:restartNumberingAfterBreak="0">
+  <w:abstractNum w:abstractNumId="24" w15:restartNumberingAfterBreak="0">
     <w:nsid w:val="65215DBB"/>
     <w:multiLevelType w:val="hybridMultilevel"/>
     <w:tmpl w:val="2BA27376"/>
@@ -3993,7 +4096,7 @@
       </w:rPr>
     </w:lvl>
   </w:abstractNum>
-  <w:abstractNum w:abstractNumId="24" w15:restartNumberingAfterBreak="0">
+  <w:abstractNum w:abstractNumId="25" w15:restartNumberingAfterBreak="0">
     <w:nsid w:val="6962113D"/>
     <w:multiLevelType w:val="hybridMultilevel"/>
     <w:tmpl w:val="10F03594"/>
@@ -4106,7 +4209,7 @@
       </w:rPr>
     </w:lvl>
   </w:abstractNum>
-  <w:abstractNum w:abstractNumId="25" w15:restartNumberingAfterBreak="0">
+  <w:abstractNum w:abstractNumId="26" w15:restartNumberingAfterBreak="0">
     <w:nsid w:val="78D726E2"/>
     <w:multiLevelType w:val="hybridMultilevel"/>
     <w:tmpl w:val="CC044256"/>
@@ -4218,82 +4321,85 @@
       </w:rPr>
     </w:lvl>
   </w:abstractNum>
-  <w:num w:numId="1">
+  <w:num w:numId="1" w16cid:durableId="519972031">
     <w:abstractNumId w:val="6"/>
   </w:num>
-  <w:num w:numId="2">
+  <w:num w:numId="2" w16cid:durableId="1194802046">
     <w:abstractNumId w:val="5"/>
   </w:num>
-  <w:num w:numId="3">
+  <w:num w:numId="3" w16cid:durableId="1062555739">
     <w:abstractNumId w:val="3"/>
   </w:num>
-  <w:num w:numId="4">
+  <w:num w:numId="4" w16cid:durableId="1739211391">
     <w:abstractNumId w:val="1"/>
   </w:num>
-  <w:num w:numId="5">
+  <w:num w:numId="5" w16cid:durableId="1310403499">
     <w:abstractNumId w:val="7"/>
   </w:num>
-  <w:num w:numId="6">
+  <w:num w:numId="6" w16cid:durableId="1813327258">
     <w:abstractNumId w:val="9"/>
   </w:num>
-  <w:num w:numId="7">
+  <w:num w:numId="7" w16cid:durableId="1600747906">
     <w:abstractNumId w:val="8"/>
   </w:num>
-  <w:num w:numId="8">
+  <w:num w:numId="8" w16cid:durableId="939532081">
+    <w:abstractNumId w:val="20"/>
+  </w:num>
+  <w:num w:numId="9" w16cid:durableId="419255899">
+    <w:abstractNumId w:val="16"/>
+  </w:num>
+  <w:num w:numId="10" w16cid:durableId="1237786955">
+    <w:abstractNumId w:val="17"/>
+  </w:num>
+  <w:num w:numId="11" w16cid:durableId="1291668079">
+    <w:abstractNumId w:val="14"/>
+  </w:num>
+  <w:num w:numId="12" w16cid:durableId="1863929537">
+    <w:abstractNumId w:val="25"/>
+  </w:num>
+  <w:num w:numId="13" w16cid:durableId="1614902813">
+    <w:abstractNumId w:val="23"/>
+  </w:num>
+  <w:num w:numId="14" w16cid:durableId="513810758">
+    <w:abstractNumId w:val="13"/>
+  </w:num>
+  <w:num w:numId="15" w16cid:durableId="1752199493">
     <w:abstractNumId w:val="19"/>
   </w:num>
-  <w:num w:numId="9">
+  <w:num w:numId="16" w16cid:durableId="1771318338">
+    <w:abstractNumId w:val="0"/>
+  </w:num>
+  <w:num w:numId="17" w16cid:durableId="381095327">
+    <w:abstractNumId w:val="2"/>
+  </w:num>
+  <w:num w:numId="18" w16cid:durableId="430317958">
+    <w:abstractNumId w:val="22"/>
+  </w:num>
+  <w:num w:numId="19" w16cid:durableId="1412198310">
+    <w:abstractNumId w:val="26"/>
+  </w:num>
+  <w:num w:numId="20" w16cid:durableId="1037000892">
+    <w:abstractNumId w:val="24"/>
+  </w:num>
+  <w:num w:numId="21" w16cid:durableId="137695315">
+    <w:abstractNumId w:val="21"/>
+  </w:num>
+  <w:num w:numId="22" w16cid:durableId="59452763">
     <w:abstractNumId w:val="15"/>
   </w:num>
-  <w:num w:numId="10">
-    <w:abstractNumId w:val="16"/>
+  <w:num w:numId="23" w16cid:durableId="393478599">
+    <w:abstractNumId w:val="18"/>
   </w:num>
-  <w:num w:numId="11">
-    <w:abstractNumId w:val="13"/>
-  </w:num>
-  <w:num w:numId="12">
-    <w:abstractNumId w:val="24"/>
-  </w:num>
-  <w:num w:numId="13">
-    <w:abstractNumId w:val="22"/>
-  </w:num>
-  <w:num w:numId="14">
+  <w:num w:numId="24" w16cid:durableId="1017578490">
     <w:abstractNumId w:val="12"/>
   </w:num>
-  <w:num w:numId="15">
-    <w:abstractNumId w:val="18"/>
+  <w:num w:numId="25" w16cid:durableId="657465419">
+    <w:abstractNumId w:val="4"/>
   </w:num>
-  <w:num w:numId="16">
-    <w:abstractNumId w:val="0"/>
-  </w:num>
-  <w:num w:numId="17">
-    <w:abstractNumId w:val="2"/>
-  </w:num>
-  <w:num w:numId="18">
-    <w:abstractNumId w:val="21"/>
-  </w:num>
-  <w:num w:numId="19">
-    <w:abstractNumId w:val="25"/>
-  </w:num>
-  <w:num w:numId="20">
-    <w:abstractNumId w:val="23"/>
-  </w:num>
-  <w:num w:numId="21">
-    <w:abstractNumId w:val="20"/>
-  </w:num>
-  <w:num w:numId="22">
-    <w:abstractNumId w:val="14"/>
-  </w:num>
-  <w:num w:numId="23">
-    <w:abstractNumId w:val="17"/>
-  </w:num>
-  <w:num w:numId="24">
+  <w:num w:numId="26" w16cid:durableId="1194229484">
     <w:abstractNumId w:val="11"/>
   </w:num>
-  <w:num w:numId="25">
-    <w:abstractNumId w:val="4"/>
-  </w:num>
-  <w:num w:numId="26">
+  <w:num w:numId="27" w16cid:durableId="908998735">
     <w:abstractNumId w:val="10"/>
   </w:num>
 </w:numbering>
@@ -4776,6 +4882,7 @@
   <w:style w:type="character" w:default="1" w:styleId="Absatz-Standardschriftart">
     <w:name w:val="Default Paragraph Font"/>
     <w:uiPriority w:val="1"/>
+    <w:semiHidden/>
     <w:unhideWhenUsed/>
   </w:style>
   <w:style w:type="table" w:default="1" w:styleId="NormaleTabelle">

</xml_diff>